<commit_message>
Align 1B strategy and runbook with official YC RFS text
Rework compliance project to financial/state-licensing scope, update
CrewOS to YC's agent/robot/human framing, and add official
Self-Maintaining APIs quotes to the DriftFix pitch.

Co-Authored-By: Claude Opus 5.5 <noreply@anthropic.com>
Claude-Session: https://claude.ai/code/session_01WAwGtQCh2wsRR15PFqeZvt
</commit_message>
<xml_diff>
--- a/Compiled15_1B_YC_RFS_Strategy.docx
+++ b/Compiled15_1B_YC_RFS_Strategy.docx
@@ -48,7 +48,7 @@
           <w:sz w:val="20"/>
           <w:szCs w:val="20"/>
         </w:rPr>
-        <w:t xml:space="preserve">Prepared October 10, 2026 for the October 11 event. Scores are analyst judgments, not the organizers' rubric. YC's page was not reachable from the research environment; RFS summaries come from secondary write-ups and should be checked against ycombinator.com/rfs.</w:t>
+        <w:t xml:space="preserve">Prepared October 10, 2026 for the October 11 event. Scores are analyst judgments, not the organizers' rubric. RFS summaries were checked against the official text of ycombinator.com/rfs (Fall 2026).</w:t>
       </w:r>
     </w:p>
     <w:p>
@@ -76,7 +76,7 @@
         <w:t xml:space="preserve">Recommendation: </w:t>
       </w:r>
       <w:r>
-        <w:t xml:space="preserve">Build DriftFix for the Self-Maintaining APIs request. It scores 9.00, the highest of 13. YC's own framing asks for agents that "scan customer codebases and open a pull request with the fix", which is exactly the demo.</w:t>
+        <w:t xml:space="preserve">Build DriftFix for the Self-Maintaining APIs request. It scores 9.00, the highest of 13. YC's request says that when Stripe ships a breaking change, "an agent should scan customer codebases, identify affected usages, and open a PR with the fix", which is exactly the demo.</w:t>
       </w:r>
     </w:p>
     <w:p>
@@ -2552,7 +2552,7 @@
                 <w:sz w:val="17"/>
                 <w:szCs w:val="17"/>
               </w:rPr>
-              <w:t xml:space="preserve">AI-Native Compliance Infrastructure</w:t>
+              <w:t xml:space="preserve">New OS for the Physical World</w:t>
             </w:r>
           </w:p>
         </w:tc>
@@ -2581,7 +2581,7 @@
                 <w:sz w:val="17"/>
                 <w:szCs w:val="17"/>
               </w:rPr>
-              <w:t xml:space="preserve">EvidenceLoop</w:t>
+              <w:t xml:space="preserve">CrewOS</w:t>
             </w:r>
           </w:p>
         </w:tc>
@@ -2726,36 +2726,36 @@
                 <w:sz w:val="17"/>
                 <w:szCs w:val="17"/>
               </w:rPr>
+              <w:t xml:space="preserve">8</w:t>
+            </w:r>
+          </w:p>
+        </w:tc>
+        <w:tc>
+          <w:tcPr>
+            <w:tcW w:type="dxa" w:w="500"/>
+            <w:tcBorders>
+              <w:top w:val="single" w:color="BBBBBB" w:sz="4"/>
+              <w:left w:val="single" w:color="BBBBBB" w:sz="4"/>
+              <w:bottom w:val="single" w:color="BBBBBB" w:sz="4"/>
+              <w:right w:val="single" w:color="BBBBBB" w:sz="4"/>
+            </w:tcBorders>
+            <w:tcMar>
+              <w:top w:type="dxa" w:w="50"/>
+              <w:left w:type="dxa" w:w="70"/>
+              <w:bottom w:type="dxa" w:w="50"/>
+              <w:right w:type="dxa" w:w="70"/>
+            </w:tcMar>
+          </w:tcPr>
+          <w:p>
+            <w:r>
+              <w:rPr>
+                <w:b w:val="false"/>
+                <w:bCs w:val="false"/>
+                <w:color w:val="000000"/>
+                <w:sz w:val="17"/>
+                <w:szCs w:val="17"/>
+              </w:rPr>
               <w:t xml:space="preserve">7</w:t>
-            </w:r>
-          </w:p>
-        </w:tc>
-        <w:tc>
-          <w:tcPr>
-            <w:tcW w:type="dxa" w:w="500"/>
-            <w:tcBorders>
-              <w:top w:val="single" w:color="BBBBBB" w:sz="4"/>
-              <w:left w:val="single" w:color="BBBBBB" w:sz="4"/>
-              <w:bottom w:val="single" w:color="BBBBBB" w:sz="4"/>
-              <w:right w:val="single" w:color="BBBBBB" w:sz="4"/>
-            </w:tcBorders>
-            <w:tcMar>
-              <w:top w:type="dxa" w:w="50"/>
-              <w:left w:type="dxa" w:w="70"/>
-              <w:bottom w:type="dxa" w:w="50"/>
-              <w:right w:type="dxa" w:w="70"/>
-            </w:tcMar>
-          </w:tcPr>
-          <w:p>
-            <w:r>
-              <w:rPr>
-                <w:b w:val="false"/>
-                <w:bCs w:val="false"/>
-                <w:color w:val="000000"/>
-                <w:sz w:val="17"/>
-                <w:szCs w:val="17"/>
-              </w:rPr>
-              <w:t xml:space="preserve">8</w:t>
             </w:r>
           </w:p>
         </w:tc>
@@ -2876,7 +2876,7 @@
                 <w:sz w:val="17"/>
                 <w:szCs w:val="17"/>
               </w:rPr>
-              <w:t xml:space="preserve">New OS for the Physical World</w:t>
+              <w:t xml:space="preserve">AI-Native Compliance Infrastructure</w:t>
             </w:r>
           </w:p>
         </w:tc>
@@ -2905,7 +2905,7 @@
                 <w:sz w:val="17"/>
                 <w:szCs w:val="17"/>
               </w:rPr>
-              <w:t xml:space="preserve">CrewOS</w:t>
+              <w:t xml:space="preserve">LicenseLoop</w:t>
             </w:r>
           </w:p>
         </w:tc>
@@ -2992,7 +2992,7 @@
                 <w:sz w:val="17"/>
                 <w:szCs w:val="17"/>
               </w:rPr>
-              <w:t xml:space="preserve">9</w:t>
+              <w:t xml:space="preserve">10</w:t>
             </w:r>
           </w:p>
         </w:tc>
@@ -3137,7 +3137,7 @@
                 <w:sz w:val="17"/>
                 <w:szCs w:val="17"/>
               </w:rPr>
-              <w:t xml:space="preserve">7.65</w:t>
+              <w:t xml:space="preserve">7.80</w:t>
             </w:r>
           </w:p>
         </w:tc>
@@ -5890,7 +5890,7 @@
           <w:b/>
           <w:bCs/>
         </w:rPr>
-        <w:t xml:space="preserve">4. EvidenceLoop (AI-Native Compliance Infrastructure), 7.90</w:t>
+        <w:t xml:space="preserve">4. CrewOS (New OS for the Physical World), 7.90</w:t>
       </w:r>
     </w:p>
     <w:p>
@@ -5898,7 +5898,7 @@
         <w:spacing w:after="40"/>
       </w:pPr>
       <w:r>
-        <w:t xml:space="preserve">Continuously pulls evidence from GitHub and AWS config, maps it to SOC 2 controls, flags drift with an audit trail.</w:t>
+        <w:t xml:space="preserve">Operating system that routes each field job to an AI agent, a robot or a human crew, and records the work as it happens.</w:t>
       </w:r>
     </w:p>
     <w:p>
@@ -5916,7 +5916,7 @@
           <w:sz w:val="19"/>
           <w:szCs w:val="19"/>
         </w:rPr>
-        <w:t xml:space="preserve">MVP: 10 controls, GitHub branch protection and IAM checks, evidence records with provenance, drift alerts. Demo: flip a repo setting and watch a control go red. Risk: overclaiming audit readiness.</w:t>
+        <w:t xml:space="preserve">MVP: job intake, AI quoting agent, router that assigns sub-tasks to agent / simulated robot / human, tech mobile view with photo proof-of-work, safety and reliability log. Demo: a new job is split three ways live. Risk: robots are simulated. (Updated to match YC's "three kinds of workers" framing.)</w:t>
       </w:r>
     </w:p>
     <w:p>
@@ -5932,7 +5932,7 @@
           <w:b/>
           <w:bCs/>
         </w:rPr>
-        <w:t xml:space="preserve">5. CrewOS (New OS for the Physical World), 7.65</w:t>
+        <w:t xml:space="preserve">5. LicenseLoop (AI-Native Compliance Infrastructure), 7.80</w:t>
       </w:r>
     </w:p>
     <w:p>
@@ -5940,7 +5940,7 @@
         <w:spacing w:after="40"/>
       </w:pPr>
       <w:r>
-        <w:t xml:space="preserve">Dispatch brain for field crews: job intake, AI scheduling, SMS to techs, photo proof-of-work.</w:t>
+        <w:t xml:space="preserve">Real-time view of a fintech's state-by-state licenses: renewal deadlines, regulatory changes mapped to affected licenses, and an audit trail.</w:t>
       </w:r>
     </w:p>
     <w:p>
@@ -5958,7 +5958,7 @@
           <w:sz w:val="19"/>
           <w:szCs w:val="19"/>
         </w:rPr>
-        <w:t xml:space="preserve">MVP: job intake form, schedule builder, tech mobile view, photo verification by vision model. Demo: new urgent job reshuffles the day. Risk: realism of routing and integrations.</w:t>
+        <w:t xml:space="preserve">MVP: 10-state license register, deadline engine, LLM summaries of regulator notices mapped to affected licenses with citations, finance-team dashboard. Demo: a new state rule arrives and the affected licenses and tasks light up. Risk: legal accuracy; label output as review-required. (Reworked: YC's text is about financial compliance and state licensing, not SOC 2.)</w:t>
       </w:r>
     </w:p>
     <w:p>
@@ -6335,6 +6335,22 @@
           <w:bCs/>
         </w:rPr>
         <w:t xml:space="preserve">Problem and buyer</w:t>
+      </w:r>
+    </w:p>
+    <w:p>
+      <w:pPr>
+        <w:spacing w:after="100"/>
+        <w:rPr>
+          <w:i/>
+          <w:iCs/>
+        </w:rPr>
+      </w:pPr>
+      <w:r>
+        <w:rPr>
+          <w:i/>
+          <w:iCs/>
+        </w:rPr>
+        <w:t xml:space="preserve">From the RFS author (Harsha Gaddipati): at AWS, over 30% of service downtime came from external API or package changes going unnoticed. YC suggests two shapes: per-provider agents ("Install Stripe's update agent") or a neutral third-party service, "like Dependabot but for APIs". DriftFix starts as per-provider agents sold to API vendors.</w:t>
       </w:r>
     </w:p>
     <w:p>
@@ -9445,7 +9461,7 @@
         <w:t xml:space="preserve">Versus Dependabot? </w:t>
       </w:r>
       <w:r>
-        <w:t xml:space="preserve">Dependabot and Renovate bump versions; DriftFix rewrites code to a changed contract and proves it with tests.</w:t>
+        <w:t xml:space="preserve">YC itself frames this as "Dependabot but for APIs". Dependabot bumps package versions; DriftFix rewrites your code to a changed API contract and proves it with tests.</w:t>
       </w:r>
     </w:p>
     <w:p>
@@ -9787,7 +9803,7 @@
         <w:spacing w:after="60"/>
       </w:pPr>
       <w:r>
-        <w:t xml:space="preserve">Tonight: read the official RFS page and agree on the 5 breaking changes, repo layout and roles on paper. No code before noon.</w:t>
+        <w:t xml:space="preserve">Tonight: agree on the 5 breaking changes, repo layout and roles on paper. No code before noon.</w:t>
       </w:r>
     </w:p>
     <w:p>
@@ -9855,59 +9871,7 @@
         <w:spacing w:after="60"/>
       </w:pPr>
       <w:r>
-        <w:t xml:space="preserve">ycombinator.com/rfs (official, not reachable from the research sandbox)</w:t>
-      </w:r>
-    </w:p>
-    <w:p>
-      <w:pPr>
-        <w:pStyle w:val="ListParagraph"/>
-        <w:numPr>
-          <w:ilvl w:val="0"/>
-          <w:numId w:val="2"/>
-        </w:numPr>
-        <w:spacing w:after="60"/>
-      </w:pPr>
-      <w:r>
-        <w:t xml:space="preserve">vccafe.com/requests-for-startups-fall-2026-edition</w:t>
-      </w:r>
-    </w:p>
-    <w:p>
-      <w:pPr>
-        <w:pStyle w:val="ListParagraph"/>
-        <w:numPr>
-          <w:ilvl w:val="0"/>
-          <w:numId w:val="2"/>
-        </w:numPr>
-        <w:spacing w:after="60"/>
-      </w:pPr>
-      <w:r>
-        <w:t xml:space="preserve">superframeworks.com/articles/yc-fall-2026-rfs-indie-hacker-plays</w:t>
-      </w:r>
-    </w:p>
-    <w:p>
-      <w:pPr>
-        <w:pStyle w:val="ListParagraph"/>
-        <w:numPr>
-          <w:ilvl w:val="0"/>
-          <w:numId w:val="2"/>
-        </w:numPr>
-        <w:spacing w:after="60"/>
-      </w:pPr>
-      <w:r>
-        <w:t xml:space="preserve">modelence.com/yc-rfs-fall-2026</w:t>
-      </w:r>
-    </w:p>
-    <w:p>
-      <w:pPr>
-        <w:pStyle w:val="ListParagraph"/>
-        <w:numPr>
-          <w:ilvl w:val="0"/>
-          <w:numId w:val="2"/>
-        </w:numPr>
-        <w:spacing w:after="60"/>
-      </w:pPr>
-      <w:r>
-        <w:t xml:space="preserve">explainx.ai/blog/yc-requests-for-startups-fall-2026</w:t>
+        <w:t xml:space="preserve">ycombinator.com/rfs, Fall 2026 (official text, provided by the team)</w:t>
       </w:r>
     </w:p>
     <w:sectPr>

</xml_diff>

<commit_message>
Add mapping between 1B projects and original report's projects
Co-Authored-By: Claude Opus 5.5 <noreply@anthropic.com>
Claude-Session: https://claude.ai/code/session_01WAwGtQCh2wsRR15PFqeZvt
</commit_message>
<xml_diff>
--- a/Compiled15_1B_YC_RFS_Strategy.docx
+++ b/Compiled15_1B_YC_RFS_Strategy.docx
@@ -6297,6 +6297,1147 @@
         <w:t xml:space="preserve">MVP: cost/cooling model over ocean sites, map. Demo: choose a site. Risk: no validation possible at the event.</w:t>
       </w:r>
     </w:p>
+    <w:p>
+      <w:pPr>
+        <w:pStyle w:val="Heading2"/>
+      </w:pPr>
+      <w:r>
+        <w:t xml:space="preserve">How these map to the original report</w:t>
+      </w:r>
+    </w:p>
+    <w:p>
+      <w:pPr>
+        <w:spacing w:after="100"/>
+      </w:pPr>
+      <w:r>
+        <w:t xml:space="preserve">Names differ from the original 15-project report. About half the ideas are the same or closely related; scores differ because this report uses a different rubric.</w:t>
+      </w:r>
+    </w:p>
+    <w:tbl>
+      <w:tblPr>
+        <w:tblW w:type="dxa" w:w="9360"/>
+        <w:tblBorders>
+          <w:top w:val="single" w:color="auto" w:sz="4"/>
+          <w:left w:val="single" w:color="auto" w:sz="4"/>
+          <w:bottom w:val="single" w:color="auto" w:sz="4"/>
+          <w:right w:val="single" w:color="auto" w:sz="4"/>
+          <w:insideH w:val="single" w:color="auto" w:sz="4"/>
+          <w:insideV w:val="single" w:color="auto" w:sz="4"/>
+        </w:tblBorders>
+      </w:tblPr>
+      <w:tblGrid>
+        <w:gridCol w:w="2300"/>
+        <w:gridCol w:w="2100"/>
+        <w:gridCol w:w="4960"/>
+      </w:tblGrid>
+      <w:tr>
+        <w:trPr>
+          <w:tblHeader/>
+        </w:trPr>
+        <w:tc>
+          <w:tcPr>
+            <w:tcW w:type="dxa" w:w="2300"/>
+            <w:tcBorders>
+              <w:top w:val="single" w:color="BBBBBB" w:sz="4"/>
+              <w:left w:val="single" w:color="BBBBBB" w:sz="4"/>
+              <w:bottom w:val="single" w:color="BBBBBB" w:sz="4"/>
+              <w:right w:val="single" w:color="BBBBBB" w:sz="4"/>
+            </w:tcBorders>
+            <w:shd w:fill="1F3864" w:color="auto" w:val="clear"/>
+            <w:tcMar>
+              <w:top w:type="dxa" w:w="50"/>
+              <w:left w:type="dxa" w:w="70"/>
+              <w:bottom w:type="dxa" w:w="50"/>
+              <w:right w:type="dxa" w:w="70"/>
+            </w:tcMar>
+          </w:tcPr>
+          <w:p>
+            <w:r>
+              <w:rPr>
+                <w:b/>
+                <w:bCs/>
+                <w:color w:val="FFFFFF"/>
+                <w:sz w:val="18"/>
+                <w:szCs w:val="18"/>
+              </w:rPr>
+              <w:t xml:space="preserve">This report</w:t>
+            </w:r>
+          </w:p>
+        </w:tc>
+        <w:tc>
+          <w:tcPr>
+            <w:tcW w:type="dxa" w:w="2100"/>
+            <w:tcBorders>
+              <w:top w:val="single" w:color="BBBBBB" w:sz="4"/>
+              <w:left w:val="single" w:color="BBBBBB" w:sz="4"/>
+              <w:bottom w:val="single" w:color="BBBBBB" w:sz="4"/>
+              <w:right w:val="single" w:color="BBBBBB" w:sz="4"/>
+            </w:tcBorders>
+            <w:shd w:fill="1F3864" w:color="auto" w:val="clear"/>
+            <w:tcMar>
+              <w:top w:type="dxa" w:w="50"/>
+              <w:left w:type="dxa" w:w="70"/>
+              <w:bottom w:type="dxa" w:w="50"/>
+              <w:right w:type="dxa" w:w="70"/>
+            </w:tcMar>
+          </w:tcPr>
+          <w:p>
+            <w:r>
+              <w:rPr>
+                <w:b/>
+                <w:bCs/>
+                <w:color w:val="FFFFFF"/>
+                <w:sz w:val="18"/>
+                <w:szCs w:val="18"/>
+              </w:rPr>
+              <w:t xml:space="preserve">Original report</w:t>
+            </w:r>
+          </w:p>
+        </w:tc>
+        <w:tc>
+          <w:tcPr>
+            <w:tcW w:type="dxa" w:w="4960"/>
+            <w:tcBorders>
+              <w:top w:val="single" w:color="BBBBBB" w:sz="4"/>
+              <w:left w:val="single" w:color="BBBBBB" w:sz="4"/>
+              <w:bottom w:val="single" w:color="BBBBBB" w:sz="4"/>
+              <w:right w:val="single" w:color="BBBBBB" w:sz="4"/>
+            </w:tcBorders>
+            <w:shd w:fill="1F3864" w:color="auto" w:val="clear"/>
+            <w:tcMar>
+              <w:top w:type="dxa" w:w="50"/>
+              <w:left w:type="dxa" w:w="70"/>
+              <w:bottom w:type="dxa" w:w="50"/>
+              <w:right w:type="dxa" w:w="70"/>
+            </w:tcMar>
+          </w:tcPr>
+          <w:p>
+            <w:r>
+              <w:rPr>
+                <w:b/>
+                <w:bCs/>
+                <w:color w:val="FFFFFF"/>
+                <w:sz w:val="18"/>
+                <w:szCs w:val="18"/>
+              </w:rPr>
+              <w:t xml:space="preserve">Relationship</w:t>
+            </w:r>
+          </w:p>
+        </w:tc>
+      </w:tr>
+      <w:tr>
+        <w:trPr>
+          <w:tblHeader w:val="false"/>
+        </w:trPr>
+        <w:tc>
+          <w:tcPr>
+            <w:tcW w:type="dxa" w:w="2300"/>
+            <w:tcBorders>
+              <w:top w:val="single" w:color="BBBBBB" w:sz="4"/>
+              <w:left w:val="single" w:color="BBBBBB" w:sz="4"/>
+              <w:bottom w:val="single" w:color="BBBBBB" w:sz="4"/>
+              <w:right w:val="single" w:color="BBBBBB" w:sz="4"/>
+            </w:tcBorders>
+            <w:tcMar>
+              <w:top w:type="dxa" w:w="50"/>
+              <w:left w:type="dxa" w:w="70"/>
+              <w:bottom w:type="dxa" w:w="50"/>
+              <w:right w:type="dxa" w:w="70"/>
+            </w:tcMar>
+          </w:tcPr>
+          <w:p>
+            <w:r>
+              <w:rPr>
+                <w:b w:val="false"/>
+                <w:bCs w:val="false"/>
+                <w:color w:val="000000"/>
+                <w:sz w:val="18"/>
+                <w:szCs w:val="18"/>
+              </w:rPr>
+              <w:t xml:space="preserve">DriftFix</w:t>
+            </w:r>
+          </w:p>
+        </w:tc>
+        <w:tc>
+          <w:tcPr>
+            <w:tcW w:type="dxa" w:w="2100"/>
+            <w:tcBorders>
+              <w:top w:val="single" w:color="BBBBBB" w:sz="4"/>
+              <w:left w:val="single" w:color="BBBBBB" w:sz="4"/>
+              <w:bottom w:val="single" w:color="BBBBBB" w:sz="4"/>
+              <w:right w:val="single" w:color="BBBBBB" w:sz="4"/>
+            </w:tcBorders>
+            <w:tcMar>
+              <w:top w:type="dxa" w:w="50"/>
+              <w:left w:type="dxa" w:w="70"/>
+              <w:bottom w:type="dxa" w:w="50"/>
+              <w:right w:type="dxa" w:w="70"/>
+            </w:tcMar>
+          </w:tcPr>
+          <w:p>
+            <w:r>
+              <w:rPr>
+                <w:b w:val="false"/>
+                <w:bCs w:val="false"/>
+                <w:color w:val="000000"/>
+                <w:sz w:val="18"/>
+                <w:szCs w:val="18"/>
+              </w:rPr>
+              <w:t xml:space="preserve">PatchForge</w:t>
+            </w:r>
+          </w:p>
+        </w:tc>
+        <w:tc>
+          <w:tcPr>
+            <w:tcW w:type="dxa" w:w="4960"/>
+            <w:tcBorders>
+              <w:top w:val="single" w:color="BBBBBB" w:sz="4"/>
+              <w:left w:val="single" w:color="BBBBBB" w:sz="4"/>
+              <w:bottom w:val="single" w:color="BBBBBB" w:sz="4"/>
+              <w:right w:val="single" w:color="BBBBBB" w:sz="4"/>
+            </w:tcBorders>
+            <w:tcMar>
+              <w:top w:type="dxa" w:w="50"/>
+              <w:left w:type="dxa" w:w="70"/>
+              <w:bottom w:type="dxa" w:w="50"/>
+              <w:right w:type="dxa" w:w="70"/>
+            </w:tcMar>
+          </w:tcPr>
+          <w:p>
+            <w:r>
+              <w:rPr>
+                <w:b w:val="false"/>
+                <w:bCs w:val="false"/>
+                <w:color w:val="000000"/>
+                <w:sz w:val="18"/>
+                <w:szCs w:val="18"/>
+              </w:rPr>
+              <w:t xml:space="preserve">Same idea: fix code after a breaking API change, verified by tests. DriftFix adds the real GitHub PR. Not DocDrift, which only detects doc/code mismatches.</w:t>
+            </w:r>
+          </w:p>
+        </w:tc>
+      </w:tr>
+      <w:tr>
+        <w:trPr>
+          <w:tblHeader w:val="false"/>
+        </w:trPr>
+        <w:tc>
+          <w:tcPr>
+            <w:tcW w:type="dxa" w:w="2300"/>
+            <w:tcBorders>
+              <w:top w:val="single" w:color="BBBBBB" w:sz="4"/>
+              <w:left w:val="single" w:color="BBBBBB" w:sz="4"/>
+              <w:bottom w:val="single" w:color="BBBBBB" w:sz="4"/>
+              <w:right w:val="single" w:color="BBBBBB" w:sz="4"/>
+            </w:tcBorders>
+            <w:tcMar>
+              <w:top w:type="dxa" w:w="50"/>
+              <w:left w:type="dxa" w:w="70"/>
+              <w:bottom w:type="dxa" w:w="50"/>
+              <w:right w:type="dxa" w:w="70"/>
+            </w:tcMar>
+          </w:tcPr>
+          <w:p>
+            <w:r>
+              <w:rPr>
+                <w:b w:val="false"/>
+                <w:bCs w:val="false"/>
+                <w:color w:val="000000"/>
+                <w:sz w:val="18"/>
+                <w:szCs w:val="18"/>
+              </w:rPr>
+              <w:t xml:space="preserve">CareCircle</w:t>
+            </w:r>
+          </w:p>
+        </w:tc>
+        <w:tc>
+          <w:tcPr>
+            <w:tcW w:type="dxa" w:w="2100"/>
+            <w:tcBorders>
+              <w:top w:val="single" w:color="BBBBBB" w:sz="4"/>
+              <w:left w:val="single" w:color="BBBBBB" w:sz="4"/>
+              <w:bottom w:val="single" w:color="BBBBBB" w:sz="4"/>
+              <w:right w:val="single" w:color="BBBBBB" w:sz="4"/>
+            </w:tcBorders>
+            <w:tcMar>
+              <w:top w:type="dxa" w:w="50"/>
+              <w:left w:type="dxa" w:w="70"/>
+              <w:bottom w:type="dxa" w:w="50"/>
+              <w:right w:type="dxa" w:w="70"/>
+            </w:tcMar>
+          </w:tcPr>
+          <w:p>
+            <w:r>
+              <w:rPr>
+                <w:b w:val="false"/>
+                <w:bCs w:val="false"/>
+                <w:color w:val="000000"/>
+                <w:sz w:val="18"/>
+                <w:szCs w:val="18"/>
+              </w:rPr>
+              <w:t xml:space="preserve">CareRelay</w:t>
+            </w:r>
+          </w:p>
+        </w:tc>
+        <w:tc>
+          <w:tcPr>
+            <w:tcW w:type="dxa" w:w="4960"/>
+            <w:tcBorders>
+              <w:top w:val="single" w:color="BBBBBB" w:sz="4"/>
+              <w:left w:val="single" w:color="BBBBBB" w:sz="4"/>
+              <w:bottom w:val="single" w:color="BBBBBB" w:sz="4"/>
+              <w:right w:val="single" w:color="BBBBBB" w:sz="4"/>
+            </w:tcBorders>
+            <w:tcMar>
+              <w:top w:type="dxa" w:w="50"/>
+              <w:left w:type="dxa" w:w="70"/>
+              <w:bottom w:type="dxa" w:w="50"/>
+              <w:right w:type="dxa" w:w="70"/>
+            </w:tcMar>
+          </w:tcPr>
+          <w:p>
+            <w:r>
+              <w:rPr>
+                <w:b w:val="false"/>
+                <w:bCs w:val="false"/>
+                <w:color w:val="000000"/>
+                <w:sz w:val="18"/>
+                <w:szCs w:val="18"/>
+              </w:rPr>
+              <w:t xml:space="preserve">Same space: caregiver coordination. CareCircle adds daily voice check-ins with the elder.</w:t>
+            </w:r>
+          </w:p>
+        </w:tc>
+      </w:tr>
+      <w:tr>
+        <w:trPr>
+          <w:tblHeader w:val="false"/>
+        </w:trPr>
+        <w:tc>
+          <w:tcPr>
+            <w:tcW w:type="dxa" w:w="2300"/>
+            <w:tcBorders>
+              <w:top w:val="single" w:color="BBBBBB" w:sz="4"/>
+              <w:left w:val="single" w:color="BBBBBB" w:sz="4"/>
+              <w:bottom w:val="single" w:color="BBBBBB" w:sz="4"/>
+              <w:right w:val="single" w:color="BBBBBB" w:sz="4"/>
+            </w:tcBorders>
+            <w:tcMar>
+              <w:top w:type="dxa" w:w="50"/>
+              <w:left w:type="dxa" w:w="70"/>
+              <w:bottom w:type="dxa" w:w="50"/>
+              <w:right w:type="dxa" w:w="70"/>
+            </w:tcMar>
+          </w:tcPr>
+          <w:p>
+            <w:r>
+              <w:rPr>
+                <w:b w:val="false"/>
+                <w:bCs w:val="false"/>
+                <w:color w:val="000000"/>
+                <w:sz w:val="18"/>
+                <w:szCs w:val="18"/>
+              </w:rPr>
+              <w:t xml:space="preserve">Huddle</w:t>
+            </w:r>
+          </w:p>
+        </w:tc>
+        <w:tc>
+          <w:tcPr>
+            <w:tcW w:type="dxa" w:w="2100"/>
+            <w:tcBorders>
+              <w:top w:val="single" w:color="BBBBBB" w:sz="4"/>
+              <w:left w:val="single" w:color="BBBBBB" w:sz="4"/>
+              <w:bottom w:val="single" w:color="BBBBBB" w:sz="4"/>
+              <w:right w:val="single" w:color="BBBBBB" w:sz="4"/>
+            </w:tcBorders>
+            <w:tcMar>
+              <w:top w:type="dxa" w:w="50"/>
+              <w:left w:type="dxa" w:w="70"/>
+              <w:bottom w:type="dxa" w:w="50"/>
+              <w:right w:type="dxa" w:w="70"/>
+            </w:tcMar>
+          </w:tcPr>
+          <w:p>
+            <w:r>
+              <w:rPr>
+                <w:b w:val="false"/>
+                <w:bCs w:val="false"/>
+                <w:color w:val="000000"/>
+                <w:sz w:val="18"/>
+                <w:szCs w:val="18"/>
+              </w:rPr>
+              <w:t xml:space="preserve">TeamAgent</w:t>
+            </w:r>
+          </w:p>
+        </w:tc>
+        <w:tc>
+          <w:tcPr>
+            <w:tcW w:type="dxa" w:w="4960"/>
+            <w:tcBorders>
+              <w:top w:val="single" w:color="BBBBBB" w:sz="4"/>
+              <w:left w:val="single" w:color="BBBBBB" w:sz="4"/>
+              <w:bottom w:val="single" w:color="BBBBBB" w:sz="4"/>
+              <w:right w:val="single" w:color="BBBBBB" w:sz="4"/>
+            </w:tcBorders>
+            <w:tcMar>
+              <w:top w:type="dxa" w:w="50"/>
+              <w:left w:type="dxa" w:w="70"/>
+              <w:bottom w:type="dxa" w:w="50"/>
+              <w:right w:type="dxa" w:w="70"/>
+            </w:tcMar>
+          </w:tcPr>
+          <w:p>
+            <w:r>
+              <w:rPr>
+                <w:b w:val="false"/>
+                <w:bCs w:val="false"/>
+                <w:color w:val="000000"/>
+                <w:sz w:val="18"/>
+                <w:szCs w:val="18"/>
+              </w:rPr>
+              <w:t xml:space="preserve">Same idea: shared multi-user agent workspace.</w:t>
+            </w:r>
+          </w:p>
+        </w:tc>
+      </w:tr>
+      <w:tr>
+        <w:trPr>
+          <w:tblHeader w:val="false"/>
+        </w:trPr>
+        <w:tc>
+          <w:tcPr>
+            <w:tcW w:type="dxa" w:w="2300"/>
+            <w:tcBorders>
+              <w:top w:val="single" w:color="BBBBBB" w:sz="4"/>
+              <w:left w:val="single" w:color="BBBBBB" w:sz="4"/>
+              <w:bottom w:val="single" w:color="BBBBBB" w:sz="4"/>
+              <w:right w:val="single" w:color="BBBBBB" w:sz="4"/>
+            </w:tcBorders>
+            <w:tcMar>
+              <w:top w:type="dxa" w:w="50"/>
+              <w:left w:type="dxa" w:w="70"/>
+              <w:bottom w:type="dxa" w:w="50"/>
+              <w:right w:type="dxa" w:w="70"/>
+            </w:tcMar>
+          </w:tcPr>
+          <w:p>
+            <w:r>
+              <w:rPr>
+                <w:b w:val="false"/>
+                <w:bCs w:val="false"/>
+                <w:color w:val="000000"/>
+                <w:sz w:val="18"/>
+                <w:szCs w:val="18"/>
+              </w:rPr>
+              <w:t xml:space="preserve">CrewOS</w:t>
+            </w:r>
+          </w:p>
+        </w:tc>
+        <w:tc>
+          <w:tcPr>
+            <w:tcW w:type="dxa" w:w="2100"/>
+            <w:tcBorders>
+              <w:top w:val="single" w:color="BBBBBB" w:sz="4"/>
+              <w:left w:val="single" w:color="BBBBBB" w:sz="4"/>
+              <w:bottom w:val="single" w:color="BBBBBB" w:sz="4"/>
+              <w:right w:val="single" w:color="BBBBBB" w:sz="4"/>
+            </w:tcBorders>
+            <w:tcMar>
+              <w:top w:type="dxa" w:w="50"/>
+              <w:left w:type="dxa" w:w="70"/>
+              <w:bottom w:type="dxa" w:w="50"/>
+              <w:right w:type="dxa" w:w="70"/>
+            </w:tcMar>
+          </w:tcPr>
+          <w:p>
+            <w:r>
+              <w:rPr>
+                <w:b w:val="false"/>
+                <w:bCs w:val="false"/>
+                <w:color w:val="000000"/>
+                <w:sz w:val="18"/>
+                <w:szCs w:val="18"/>
+              </w:rPr>
+              <w:t xml:space="preserve">FieldRoute + ScheduleArena</w:t>
+            </w:r>
+          </w:p>
+        </w:tc>
+        <w:tc>
+          <w:tcPr>
+            <w:tcW w:type="dxa" w:w="4960"/>
+            <w:tcBorders>
+              <w:top w:val="single" w:color="BBBBBB" w:sz="4"/>
+              <w:left w:val="single" w:color="BBBBBB" w:sz="4"/>
+              <w:bottom w:val="single" w:color="BBBBBB" w:sz="4"/>
+              <w:right w:val="single" w:color="BBBBBB" w:sz="4"/>
+            </w:tcBorders>
+            <w:tcMar>
+              <w:top w:type="dxa" w:w="50"/>
+              <w:left w:type="dxa" w:w="70"/>
+              <w:bottom w:type="dxa" w:w="50"/>
+              <w:right w:type="dxa" w:w="70"/>
+            </w:tcMar>
+          </w:tcPr>
+          <w:p>
+            <w:r>
+              <w:rPr>
+                <w:b w:val="false"/>
+                <w:bCs w:val="false"/>
+                <w:color w:val="000000"/>
+                <w:sz w:val="18"/>
+                <w:szCs w:val="18"/>
+              </w:rPr>
+              <w:t xml:space="preserve">Same core: field dispatch and scheduling. CrewOS adds agent/robot/human routing from the RFS.</w:t>
+            </w:r>
+          </w:p>
+        </w:tc>
+      </w:tr>
+      <w:tr>
+        <w:trPr>
+          <w:tblHeader w:val="false"/>
+        </w:trPr>
+        <w:tc>
+          <w:tcPr>
+            <w:tcW w:type="dxa" w:w="2300"/>
+            <w:tcBorders>
+              <w:top w:val="single" w:color="BBBBBB" w:sz="4"/>
+              <w:left w:val="single" w:color="BBBBBB" w:sz="4"/>
+              <w:bottom w:val="single" w:color="BBBBBB" w:sz="4"/>
+              <w:right w:val="single" w:color="BBBBBB" w:sz="4"/>
+            </w:tcBorders>
+            <w:tcMar>
+              <w:top w:type="dxa" w:w="50"/>
+              <w:left w:type="dxa" w:w="70"/>
+              <w:bottom w:type="dxa" w:w="50"/>
+              <w:right w:type="dxa" w:w="70"/>
+            </w:tcMar>
+          </w:tcPr>
+          <w:p>
+            <w:r>
+              <w:rPr>
+                <w:b w:val="false"/>
+                <w:bCs w:val="false"/>
+                <w:color w:val="000000"/>
+                <w:sz w:val="18"/>
+                <w:szCs w:val="18"/>
+              </w:rPr>
+              <w:t xml:space="preserve">LicenseLoop</w:t>
+            </w:r>
+          </w:p>
+        </w:tc>
+        <w:tc>
+          <w:tcPr>
+            <w:tcW w:type="dxa" w:w="2100"/>
+            <w:tcBorders>
+              <w:top w:val="single" w:color="BBBBBB" w:sz="4"/>
+              <w:left w:val="single" w:color="BBBBBB" w:sz="4"/>
+              <w:bottom w:val="single" w:color="BBBBBB" w:sz="4"/>
+              <w:right w:val="single" w:color="BBBBBB" w:sz="4"/>
+            </w:tcBorders>
+            <w:tcMar>
+              <w:top w:type="dxa" w:w="50"/>
+              <w:left w:type="dxa" w:w="70"/>
+              <w:bottom w:type="dxa" w:w="50"/>
+              <w:right w:type="dxa" w:w="70"/>
+            </w:tcMar>
+          </w:tcPr>
+          <w:p>
+            <w:r>
+              <w:rPr>
+                <w:b w:val="false"/>
+                <w:bCs w:val="false"/>
+                <w:color w:val="000000"/>
+                <w:sz w:val="18"/>
+                <w:szCs w:val="18"/>
+              </w:rPr>
+              <w:t xml:space="preserve">ComplianceDiff</w:t>
+            </w:r>
+          </w:p>
+        </w:tc>
+        <w:tc>
+          <w:tcPr>
+            <w:tcW w:type="dxa" w:w="4960"/>
+            <w:tcBorders>
+              <w:top w:val="single" w:color="BBBBBB" w:sz="4"/>
+              <w:left w:val="single" w:color="BBBBBB" w:sz="4"/>
+              <w:bottom w:val="single" w:color="BBBBBB" w:sz="4"/>
+              <w:right w:val="single" w:color="BBBBBB" w:sz="4"/>
+            </w:tcBorders>
+            <w:tcMar>
+              <w:top w:type="dxa" w:w="50"/>
+              <w:left w:type="dxa" w:w="70"/>
+              <w:bottom w:type="dxa" w:w="50"/>
+              <w:right w:type="dxa" w:w="70"/>
+            </w:tcMar>
+          </w:tcPr>
+          <w:p>
+            <w:r>
+              <w:rPr>
+                <w:b w:val="false"/>
+                <w:bCs w:val="false"/>
+                <w:color w:val="000000"/>
+                <w:sz w:val="18"/>
+                <w:szCs w:val="18"/>
+              </w:rPr>
+              <w:t xml:space="preserve">Related: both trace changes to obligations. LicenseLoop focuses on financial state licensing, per the RFS.</w:t>
+            </w:r>
+          </w:p>
+        </w:tc>
+      </w:tr>
+      <w:tr>
+        <w:trPr>
+          <w:tblHeader w:val="false"/>
+        </w:trPr>
+        <w:tc>
+          <w:tcPr>
+            <w:tcW w:type="dxa" w:w="2300"/>
+            <w:tcBorders>
+              <w:top w:val="single" w:color="BBBBBB" w:sz="4"/>
+              <w:left w:val="single" w:color="BBBBBB" w:sz="4"/>
+              <w:bottom w:val="single" w:color="BBBBBB" w:sz="4"/>
+              <w:right w:val="single" w:color="BBBBBB" w:sz="4"/>
+            </w:tcBorders>
+            <w:tcMar>
+              <w:top w:type="dxa" w:w="50"/>
+              <w:left w:type="dxa" w:w="70"/>
+              <w:bottom w:type="dxa" w:w="50"/>
+              <w:right w:type="dxa" w:w="70"/>
+            </w:tcMar>
+          </w:tcPr>
+          <w:p>
+            <w:r>
+              <w:rPr>
+                <w:b w:val="false"/>
+                <w:bCs w:val="false"/>
+                <w:color w:val="000000"/>
+                <w:sz w:val="18"/>
+                <w:szCs w:val="18"/>
+              </w:rPr>
+              <w:t xml:space="preserve">PhonicsPal</w:t>
+            </w:r>
+          </w:p>
+        </w:tc>
+        <w:tc>
+          <w:tcPr>
+            <w:tcW w:type="dxa" w:w="2100"/>
+            <w:tcBorders>
+              <w:top w:val="single" w:color="BBBBBB" w:sz="4"/>
+              <w:left w:val="single" w:color="BBBBBB" w:sz="4"/>
+              <w:bottom w:val="single" w:color="BBBBBB" w:sz="4"/>
+              <w:right w:val="single" w:color="BBBBBB" w:sz="4"/>
+            </w:tcBorders>
+            <w:tcMar>
+              <w:top w:type="dxa" w:w="50"/>
+              <w:left w:type="dxa" w:w="70"/>
+              <w:bottom w:type="dxa" w:w="50"/>
+              <w:right w:type="dxa" w:w="70"/>
+            </w:tcMar>
+          </w:tcPr>
+          <w:p>
+            <w:r>
+              <w:rPr>
+                <w:b w:val="false"/>
+                <w:bCs w:val="false"/>
+                <w:color w:val="000000"/>
+                <w:sz w:val="18"/>
+                <w:szCs w:val="18"/>
+              </w:rPr>
+              <w:t xml:space="preserve">TutorLoop</w:t>
+            </w:r>
+          </w:p>
+        </w:tc>
+        <w:tc>
+          <w:tcPr>
+            <w:tcW w:type="dxa" w:w="4960"/>
+            <w:tcBorders>
+              <w:top w:val="single" w:color="BBBBBB" w:sz="4"/>
+              <w:left w:val="single" w:color="BBBBBB" w:sz="4"/>
+              <w:bottom w:val="single" w:color="BBBBBB" w:sz="4"/>
+              <w:right w:val="single" w:color="BBBBBB" w:sz="4"/>
+            </w:tcBorders>
+            <w:tcMar>
+              <w:top w:type="dxa" w:w="50"/>
+              <w:left w:type="dxa" w:w="70"/>
+              <w:bottom w:type="dxa" w:w="50"/>
+              <w:right w:type="dxa" w:w="70"/>
+            </w:tcMar>
+          </w:tcPr>
+          <w:p>
+            <w:r>
+              <w:rPr>
+                <w:b w:val="false"/>
+                <w:bCs w:val="false"/>
+                <w:color w:val="000000"/>
+                <w:sz w:val="18"/>
+                <w:szCs w:val="18"/>
+              </w:rPr>
+              <w:t xml:space="preserve">Same category, narrower (early reading).</w:t>
+            </w:r>
+          </w:p>
+        </w:tc>
+      </w:tr>
+      <w:tr>
+        <w:trPr>
+          <w:tblHeader w:val="false"/>
+        </w:trPr>
+        <w:tc>
+          <w:tcPr>
+            <w:tcW w:type="dxa" w:w="2300"/>
+            <w:tcBorders>
+              <w:top w:val="single" w:color="BBBBBB" w:sz="4"/>
+              <w:left w:val="single" w:color="BBBBBB" w:sz="4"/>
+              <w:bottom w:val="single" w:color="BBBBBB" w:sz="4"/>
+              <w:right w:val="single" w:color="BBBBBB" w:sz="4"/>
+            </w:tcBorders>
+            <w:tcMar>
+              <w:top w:type="dxa" w:w="50"/>
+              <w:left w:type="dxa" w:w="70"/>
+              <w:bottom w:type="dxa" w:w="50"/>
+              <w:right w:type="dxa" w:w="70"/>
+            </w:tcMar>
+          </w:tcPr>
+          <w:p>
+            <w:r>
+              <w:rPr>
+                <w:b w:val="false"/>
+                <w:bCs w:val="false"/>
+                <w:color w:val="000000"/>
+                <w:sz w:val="18"/>
+                <w:szCs w:val="18"/>
+              </w:rPr>
+              <w:t xml:space="preserve">Shipyard</w:t>
+            </w:r>
+          </w:p>
+        </w:tc>
+        <w:tc>
+          <w:tcPr>
+            <w:tcW w:type="dxa" w:w="2100"/>
+            <w:tcBorders>
+              <w:top w:val="single" w:color="BBBBBB" w:sz="4"/>
+              <w:left w:val="single" w:color="BBBBBB" w:sz="4"/>
+              <w:bottom w:val="single" w:color="BBBBBB" w:sz="4"/>
+              <w:right w:val="single" w:color="BBBBBB" w:sz="4"/>
+            </w:tcBorders>
+            <w:tcMar>
+              <w:top w:type="dxa" w:w="50"/>
+              <w:left w:type="dxa" w:w="70"/>
+              <w:bottom w:type="dxa" w:w="50"/>
+              <w:right w:type="dxa" w:w="70"/>
+            </w:tcMar>
+          </w:tcPr>
+          <w:p>
+            <w:r>
+              <w:rPr>
+                <w:b w:val="false"/>
+                <w:bCs w:val="false"/>
+                <w:color w:val="000000"/>
+                <w:sz w:val="18"/>
+                <w:szCs w:val="18"/>
+              </w:rPr>
+              <w:t xml:space="preserve">TinyDeploy</w:t>
+            </w:r>
+          </w:p>
+        </w:tc>
+        <w:tc>
+          <w:tcPr>
+            <w:tcW w:type="dxa" w:w="4960"/>
+            <w:tcBorders>
+              <w:top w:val="single" w:color="BBBBBB" w:sz="4"/>
+              <w:left w:val="single" w:color="BBBBBB" w:sz="4"/>
+              <w:bottom w:val="single" w:color="BBBBBB" w:sz="4"/>
+              <w:right w:val="single" w:color="BBBBBB" w:sz="4"/>
+            </w:tcBorders>
+            <w:tcMar>
+              <w:top w:type="dxa" w:w="50"/>
+              <w:left w:type="dxa" w:w="70"/>
+              <w:bottom w:type="dxa" w:w="50"/>
+              <w:right w:type="dxa" w:w="70"/>
+            </w:tcMar>
+          </w:tcPr>
+          <w:p>
+            <w:r>
+              <w:rPr>
+                <w:b w:val="false"/>
+                <w:bCs w:val="false"/>
+                <w:color w:val="000000"/>
+                <w:sz w:val="18"/>
+                <w:szCs w:val="18"/>
+              </w:rPr>
+              <w:t xml:space="preserve">Same idea.</w:t>
+            </w:r>
+          </w:p>
+        </w:tc>
+      </w:tr>
+      <w:tr>
+        <w:trPr>
+          <w:tblHeader w:val="false"/>
+        </w:trPr>
+        <w:tc>
+          <w:tcPr>
+            <w:tcW w:type="dxa" w:w="2300"/>
+            <w:tcBorders>
+              <w:top w:val="single" w:color="BBBBBB" w:sz="4"/>
+              <w:left w:val="single" w:color="BBBBBB" w:sz="4"/>
+              <w:bottom w:val="single" w:color="BBBBBB" w:sz="4"/>
+              <w:right w:val="single" w:color="BBBBBB" w:sz="4"/>
+            </w:tcBorders>
+            <w:tcMar>
+              <w:top w:type="dxa" w:w="50"/>
+              <w:left w:type="dxa" w:w="70"/>
+              <w:bottom w:type="dxa" w:w="50"/>
+              <w:right w:type="dxa" w:w="70"/>
+            </w:tcMar>
+          </w:tcPr>
+          <w:p>
+            <w:r>
+              <w:rPr>
+                <w:b w:val="false"/>
+                <w:bCs w:val="false"/>
+                <w:color w:val="000000"/>
+                <w:sz w:val="18"/>
+                <w:szCs w:val="18"/>
+              </w:rPr>
+              <w:t xml:space="preserve">HumanProof</w:t>
+            </w:r>
+          </w:p>
+        </w:tc>
+        <w:tc>
+          <w:tcPr>
+            <w:tcW w:type="dxa" w:w="2100"/>
+            <w:tcBorders>
+              <w:top w:val="single" w:color="BBBBBB" w:sz="4"/>
+              <w:left w:val="single" w:color="BBBBBB" w:sz="4"/>
+              <w:bottom w:val="single" w:color="BBBBBB" w:sz="4"/>
+              <w:right w:val="single" w:color="BBBBBB" w:sz="4"/>
+            </w:tcBorders>
+            <w:tcMar>
+              <w:top w:type="dxa" w:w="50"/>
+              <w:left w:type="dxa" w:w="70"/>
+              <w:bottom w:type="dxa" w:w="50"/>
+              <w:right w:type="dxa" w:w="70"/>
+            </w:tcMar>
+          </w:tcPr>
+          <w:p>
+            <w:r>
+              <w:rPr>
+                <w:b w:val="false"/>
+                <w:bCs w:val="false"/>
+                <w:color w:val="000000"/>
+                <w:sz w:val="18"/>
+                <w:szCs w:val="18"/>
+              </w:rPr>
+              <w:t xml:space="preserve">ProofOfHuman</w:t>
+            </w:r>
+          </w:p>
+        </w:tc>
+        <w:tc>
+          <w:tcPr>
+            <w:tcW w:type="dxa" w:w="4960"/>
+            <w:tcBorders>
+              <w:top w:val="single" w:color="BBBBBB" w:sz="4"/>
+              <w:left w:val="single" w:color="BBBBBB" w:sz="4"/>
+              <w:bottom w:val="single" w:color="BBBBBB" w:sz="4"/>
+              <w:right w:val="single" w:color="BBBBBB" w:sz="4"/>
+            </w:tcBorders>
+            <w:tcMar>
+              <w:top w:type="dxa" w:w="50"/>
+              <w:left w:type="dxa" w:w="70"/>
+              <w:bottom w:type="dxa" w:w="50"/>
+              <w:right w:type="dxa" w:w="70"/>
+            </w:tcMar>
+          </w:tcPr>
+          <w:p>
+            <w:r>
+              <w:rPr>
+                <w:b w:val="false"/>
+                <w:bCs w:val="false"/>
+                <w:color w:val="000000"/>
+                <w:sz w:val="18"/>
+                <w:szCs w:val="18"/>
+              </w:rPr>
+              <w:t xml:space="preserve">Same idea.</w:t>
+            </w:r>
+          </w:p>
+        </w:tc>
+      </w:tr>
+      <w:tr>
+        <w:trPr>
+          <w:tblHeader w:val="false"/>
+        </w:trPr>
+        <w:tc>
+          <w:tcPr>
+            <w:tcW w:type="dxa" w:w="2300"/>
+            <w:tcBorders>
+              <w:top w:val="single" w:color="BBBBBB" w:sz="4"/>
+              <w:left w:val="single" w:color="BBBBBB" w:sz="4"/>
+              <w:bottom w:val="single" w:color="BBBBBB" w:sz="4"/>
+              <w:right w:val="single" w:color="BBBBBB" w:sz="4"/>
+            </w:tcBorders>
+            <w:tcMar>
+              <w:top w:type="dxa" w:w="50"/>
+              <w:left w:type="dxa" w:w="70"/>
+              <w:bottom w:type="dxa" w:w="50"/>
+              <w:right w:type="dxa" w:w="70"/>
+            </w:tcMar>
+          </w:tcPr>
+          <w:p>
+            <w:r>
+              <w:rPr>
+                <w:b w:val="false"/>
+                <w:bCs w:val="false"/>
+                <w:color w:val="000000"/>
+                <w:sz w:val="18"/>
+                <w:szCs w:val="18"/>
+              </w:rPr>
+              <w:t xml:space="preserve">FieldLens</w:t>
+            </w:r>
+          </w:p>
+        </w:tc>
+        <w:tc>
+          <w:tcPr>
+            <w:tcW w:type="dxa" w:w="2100"/>
+            <w:tcBorders>
+              <w:top w:val="single" w:color="BBBBBB" w:sz="4"/>
+              <w:left w:val="single" w:color="BBBBBB" w:sz="4"/>
+              <w:bottom w:val="single" w:color="BBBBBB" w:sz="4"/>
+              <w:right w:val="single" w:color="BBBBBB" w:sz="4"/>
+            </w:tcBorders>
+            <w:tcMar>
+              <w:top w:type="dxa" w:w="50"/>
+              <w:left w:type="dxa" w:w="70"/>
+              <w:bottom w:type="dxa" w:w="50"/>
+              <w:right w:type="dxa" w:w="70"/>
+            </w:tcMar>
+          </w:tcPr>
+          <w:p>
+            <w:r>
+              <w:rPr>
+                <w:b w:val="false"/>
+                <w:bCs w:val="false"/>
+                <w:color w:val="000000"/>
+                <w:sz w:val="18"/>
+                <w:szCs w:val="18"/>
+              </w:rPr>
+              <w:t xml:space="preserve">SensorGap</w:t>
+            </w:r>
+          </w:p>
+        </w:tc>
+        <w:tc>
+          <w:tcPr>
+            <w:tcW w:type="dxa" w:w="4960"/>
+            <w:tcBorders>
+              <w:top w:val="single" w:color="BBBBBB" w:sz="4"/>
+              <w:left w:val="single" w:color="BBBBBB" w:sz="4"/>
+              <w:bottom w:val="single" w:color="BBBBBB" w:sz="4"/>
+              <w:right w:val="single" w:color="BBBBBB" w:sz="4"/>
+            </w:tcBorders>
+            <w:tcMar>
+              <w:top w:type="dxa" w:w="50"/>
+              <w:left w:type="dxa" w:w="70"/>
+              <w:bottom w:type="dxa" w:w="50"/>
+              <w:right w:type="dxa" w:w="70"/>
+            </w:tcMar>
+          </w:tcPr>
+          <w:p>
+            <w:r>
+              <w:rPr>
+                <w:b w:val="false"/>
+                <w:bCs w:val="false"/>
+                <w:color w:val="000000"/>
+                <w:sz w:val="18"/>
+                <w:szCs w:val="18"/>
+              </w:rPr>
+              <w:t xml:space="preserve">Loosely related: SensorGap optimized sensor placement; FieldLens captures data by phone.</w:t>
+            </w:r>
+          </w:p>
+        </w:tc>
+      </w:tr>
+      <w:tr>
+        <w:trPr>
+          <w:tblHeader w:val="false"/>
+        </w:trPr>
+        <w:tc>
+          <w:tcPr>
+            <w:tcW w:type="dxa" w:w="2300"/>
+            <w:tcBorders>
+              <w:top w:val="single" w:color="BBBBBB" w:sz="4"/>
+              <w:left w:val="single" w:color="BBBBBB" w:sz="4"/>
+              <w:bottom w:val="single" w:color="BBBBBB" w:sz="4"/>
+              <w:right w:val="single" w:color="BBBBBB" w:sz="4"/>
+            </w:tcBorders>
+            <w:tcMar>
+              <w:top w:type="dxa" w:w="50"/>
+              <w:left w:type="dxa" w:w="70"/>
+              <w:bottom w:type="dxa" w:w="50"/>
+              <w:right w:type="dxa" w:w="70"/>
+            </w:tcMar>
+          </w:tcPr>
+          <w:p>
+            <w:r>
+              <w:rPr>
+                <w:b w:val="false"/>
+                <w:bCs w:val="false"/>
+                <w:color w:val="000000"/>
+                <w:sz w:val="18"/>
+                <w:szCs w:val="18"/>
+              </w:rPr>
+              <w:t xml:space="preserve">LabelLens, AgentEscrow, PartsTrace, SeaSite</w:t>
+            </w:r>
+          </w:p>
+        </w:tc>
+        <w:tc>
+          <w:tcPr>
+            <w:tcW w:type="dxa" w:w="2100"/>
+            <w:tcBorders>
+              <w:top w:val="single" w:color="BBBBBB" w:sz="4"/>
+              <w:left w:val="single" w:color="BBBBBB" w:sz="4"/>
+              <w:bottom w:val="single" w:color="BBBBBB" w:sz="4"/>
+              <w:right w:val="single" w:color="BBBBBB" w:sz="4"/>
+            </w:tcBorders>
+            <w:tcMar>
+              <w:top w:type="dxa" w:w="50"/>
+              <w:left w:type="dxa" w:w="70"/>
+              <w:bottom w:type="dxa" w:w="50"/>
+              <w:right w:type="dxa" w:w="70"/>
+            </w:tcMar>
+          </w:tcPr>
+          <w:p>
+            <w:r>
+              <w:rPr>
+                <w:b w:val="false"/>
+                <w:bCs w:val="false"/>
+                <w:color w:val="000000"/>
+                <w:sz w:val="18"/>
+                <w:szCs w:val="18"/>
+              </w:rPr>
+              <w:t xml:space="preserve">None</w:t>
+            </w:r>
+          </w:p>
+        </w:tc>
+        <w:tc>
+          <w:tcPr>
+            <w:tcW w:type="dxa" w:w="4960"/>
+            <w:tcBorders>
+              <w:top w:val="single" w:color="BBBBBB" w:sz="4"/>
+              <w:left w:val="single" w:color="BBBBBB" w:sz="4"/>
+              <w:bottom w:val="single" w:color="BBBBBB" w:sz="4"/>
+              <w:right w:val="single" w:color="BBBBBB" w:sz="4"/>
+            </w:tcBorders>
+            <w:tcMar>
+              <w:top w:type="dxa" w:w="50"/>
+              <w:left w:type="dxa" w:w="70"/>
+              <w:bottom w:type="dxa" w:w="50"/>
+              <w:right w:type="dxa" w:w="70"/>
+            </w:tcMar>
+          </w:tcPr>
+          <w:p>
+            <w:r>
+              <w:rPr>
+                <w:b w:val="false"/>
+                <w:bCs w:val="false"/>
+                <w:color w:val="000000"/>
+                <w:sz w:val="18"/>
+                <w:szCs w:val="18"/>
+              </w:rPr>
+              <w:t xml:space="preserve">New in this report.</w:t>
+            </w:r>
+          </w:p>
+        </w:tc>
+      </w:tr>
+      <w:tr>
+        <w:trPr>
+          <w:tblHeader w:val="false"/>
+        </w:trPr>
+        <w:tc>
+          <w:tcPr>
+            <w:tcW w:type="dxa" w:w="2300"/>
+            <w:tcBorders>
+              <w:top w:val="single" w:color="BBBBBB" w:sz="4"/>
+              <w:left w:val="single" w:color="BBBBBB" w:sz="4"/>
+              <w:bottom w:val="single" w:color="BBBBBB" w:sz="4"/>
+              <w:right w:val="single" w:color="BBBBBB" w:sz="4"/>
+            </w:tcBorders>
+            <w:tcMar>
+              <w:top w:type="dxa" w:w="50"/>
+              <w:left w:type="dxa" w:w="70"/>
+              <w:bottom w:type="dxa" w:w="50"/>
+              <w:right w:type="dxa" w:w="70"/>
+            </w:tcMar>
+          </w:tcPr>
+          <w:p>
+            <w:r>
+              <w:rPr>
+                <w:b w:val="false"/>
+                <w:bCs w:val="false"/>
+                <w:color w:val="000000"/>
+                <w:sz w:val="18"/>
+                <w:szCs w:val="18"/>
+              </w:rPr>
+              <w:t xml:space="preserve">None</w:t>
+            </w:r>
+          </w:p>
+        </w:tc>
+        <w:tc>
+          <w:tcPr>
+            <w:tcW w:type="dxa" w:w="2100"/>
+            <w:tcBorders>
+              <w:top w:val="single" w:color="BBBBBB" w:sz="4"/>
+              <w:left w:val="single" w:color="BBBBBB" w:sz="4"/>
+              <w:bottom w:val="single" w:color="BBBBBB" w:sz="4"/>
+              <w:right w:val="single" w:color="BBBBBB" w:sz="4"/>
+            </w:tcBorders>
+            <w:tcMar>
+              <w:top w:type="dxa" w:w="50"/>
+              <w:left w:type="dxa" w:w="70"/>
+              <w:bottom w:type="dxa" w:w="50"/>
+              <w:right w:type="dxa" w:w="70"/>
+            </w:tcMar>
+          </w:tcPr>
+          <w:p>
+            <w:r>
+              <w:rPr>
+                <w:b w:val="false"/>
+                <w:bCs w:val="false"/>
+                <w:color w:val="000000"/>
+                <w:sz w:val="18"/>
+                <w:szCs w:val="18"/>
+              </w:rPr>
+              <w:t xml:space="preserve">SQLMedic, AgentReplay, DocDrift, NonprofitClose, InferenceRouter</w:t>
+            </w:r>
+          </w:p>
+        </w:tc>
+        <w:tc>
+          <w:tcPr>
+            <w:tcW w:type="dxa" w:w="4960"/>
+            <w:tcBorders>
+              <w:top w:val="single" w:color="BBBBBB" w:sz="4"/>
+              <w:left w:val="single" w:color="BBBBBB" w:sz="4"/>
+              <w:bottom w:val="single" w:color="BBBBBB" w:sz="4"/>
+              <w:right w:val="single" w:color="BBBBBB" w:sz="4"/>
+            </w:tcBorders>
+            <w:tcMar>
+              <w:top w:type="dxa" w:w="50"/>
+              <w:left w:type="dxa" w:w="70"/>
+              <w:bottom w:type="dxa" w:w="50"/>
+              <w:right w:type="dxa" w:w="70"/>
+            </w:tcMar>
+          </w:tcPr>
+          <w:p>
+            <w:r>
+              <w:rPr>
+                <w:b w:val="false"/>
+                <w:bCs w:val="false"/>
+                <w:color w:val="000000"/>
+                <w:sz w:val="18"/>
+                <w:szCs w:val="18"/>
+              </w:rPr>
+              <w:t xml:space="preserve">Not carried over: not tied to a YC request, or better suited to Track 1A.</w:t>
+            </w:r>
+          </w:p>
+        </w:tc>
+      </w:tr>
+    </w:tbl>
     <w:p>
       <w:pPr>
         <w:pStyle w:val="Heading1"/>

</xml_diff>